<commit_message>
Update diet recommendation logic doc for the meal-combo recommendation redesign
Rewrites section 6 to describe the new getRecommendedMeals engine: meal
combos instead of single ingredients, diet-goal weighting, same-day
dedup/shuffle, and the on-demand AI coaching endpoint (decision stays
rule-based; Claude only phrases the explanation). Section 0 and the
limits section updated to match.

Co-Authored-By: Claude Sonnet 5 <noreply@anthropic.com>
</commit_message>
<xml_diff>
--- a/docs/핏마스터AI_식단추천로직.docx
+++ b/docs/핏마스터AI_식단추천로직.docx
@@ -39,7 +39,7 @@
           <w:sz w:val="19"/>
           <w:szCs w:val="19"/>
         </w:rPr>
-        <w:t xml:space="preserve">작성일: 2026-10-02</w:t>
+        <w:t xml:space="preserve">작성일: 2026-10-02  ·  최종 수정: 2026-10-02 (다음 식사 추천을 조합+AI 코칭 방식으로 개편)</w:t>
       </w:r>
     </w:p>
     <w:p>
@@ -111,6 +111,23 @@
     </w:p>
     <w:p>
       <w:pPr>
+        <w:pStyle w:val="ListParagraph"/>
+        <w:numPr>
+          <w:ilvl w:val="0"/>
+          <w:numId w:val="2"/>
+        </w:numPr>
+        <w:spacing w:after="60"/>
+      </w:pPr>
+      <w:r>
+        <w:rPr>
+          <w:sz w:val="21"/>
+          <w:szCs w:val="21"/>
+        </w:rPr>
+        <w:t xml:space="preserve">식사 추천에도 같은 원칙이 적용된다: 무엇을 추천할지는 규칙 기반 엔진이 전부 결정하고, Claude는 그 결과를 설명하는 문구만 만든다. (6장)</w:t>
+      </w:r>
+    </w:p>
+    <w:p>
+      <w:pPr>
         <w:pStyle w:val="Heading1"/>
         <w:spacing w:after="160" w:before="320"/>
       </w:pPr>
@@ -167,7 +184,7 @@
           <w:sz w:val="20"/>
           <w:szCs w:val="20"/>
         </w:rPr>
-        <w:t xml:space="preserve">대시보드: 오늘 섭취량 vs 목표 비교 → 매크로별 피드백 + 부족 영양소 기반 음식 추천</w:t>
+        <w:t xml:space="preserve">대시보드: 오늘 섭취량 vs 목표 비교 → 매크로별 피드백 + 다음 식사 추천(조합 + 선택적 AI 코칭)</w:t>
       </w:r>
     </w:p>
     <w:p>
@@ -1000,7 +1017,22 @@
           <w:sz w:val="30"/>
           <w:szCs w:val="30"/>
         </w:rPr>
-        <w:t xml:space="preserve">6. 부족 영양소 기반 추천 음식</w:t>
+        <w:t xml:space="preserve">6. 다음 식사 추천</w:t>
+      </w:r>
+    </w:p>
+    <w:p>
+      <w:pPr>
+        <w:pStyle w:val="Heading2"/>
+        <w:spacing w:after="100" w:before="240"/>
+      </w:pPr>
+      <w:r>
+        <w:rPr>
+          <w:b/>
+          <w:bCs/>
+          <w:sz w:val="24"/>
+          <w:szCs w:val="24"/>
+        </w:rPr>
+        <w:t xml:space="preserve">6.1 추천 결정 — 식사 조합 + 목적 가중치</w:t>
       </w:r>
     </w:p>
     <w:p>
@@ -1015,58 +1047,222 @@
           <w:sz w:val="19"/>
           <w:szCs w:val="19"/>
         </w:rPr>
-        <w:t xml:space="preserve">위치: src/lib/nutrition.ts — getRecommendedFoods()</w:t>
-      </w:r>
-    </w:p>
-    <w:p>
-      <w:pPr>
-        <w:pStyle w:val="ListParagraph"/>
-        <w:numPr>
-          <w:ilvl w:val="0"/>
-          <w:numId w:val="2"/>
-        </w:numPr>
-        <w:spacing w:after="60"/>
-      </w:pPr>
-      <w:r>
-        <w:rPr>
-          <w:sz w:val="21"/>
-          <w:szCs w:val="21"/>
-        </w:rPr>
-        <w:t xml:space="preserve">단백질·탄수화물·지방·식이섬유의 달성률을 계산해, 100% 미달인 영양소를 달성률이 낮은 순으로 정렬한다.</w:t>
-      </w:r>
-    </w:p>
-    <w:p>
-      <w:pPr>
-        <w:pStyle w:val="ListParagraph"/>
-        <w:numPr>
-          <w:ilvl w:val="0"/>
-          <w:numId w:val="2"/>
-        </w:numPr>
-        <w:spacing w:after="60"/>
-      </w:pPr>
-      <w:r>
-        <w:rPr>
-          <w:sz w:val="21"/>
-          <w:szCs w:val="21"/>
-        </w:rPr>
-        <w:t xml:space="preserve">모든 영양소가 이미 충족됐다면 네 개 매크로 전체를 기준으로 추천한다(fallback).</w:t>
-      </w:r>
-    </w:p>
-    <w:p>
-      <w:pPr>
-        <w:pStyle w:val="ListParagraph"/>
-        <w:numPr>
-          <w:ilvl w:val="0"/>
-          <w:numId w:val="2"/>
-        </w:numPr>
-        <w:spacing w:after="60"/>
-      </w:pPr>
-      <w:r>
-        <w:rPr>
-          <w:sz w:val="21"/>
-          <w:szCs w:val="21"/>
-        </w:rPr>
-        <w:t xml:space="preserve">정적으로 미리 정해둔 추천 음식 풀(12개: 달걀·닭가슴살·두부·그릭요거트·브로콜리 등)에서, 가장 부족한 영양소가 많은 음식부터 최대 4개를 추천한다.</w:t>
+        <w:t xml:space="preserve">위치: src/lib/nutrition.ts — getRecommendedMeals()</w:t>
+      </w:r>
+    </w:p>
+    <w:p>
+      <w:pPr>
+        <w:pStyle w:val="ListParagraph"/>
+        <w:numPr>
+          <w:ilvl w:val="0"/>
+          <w:numId w:val="2"/>
+        </w:numPr>
+        <w:spacing w:after="60"/>
+      </w:pPr>
+      <w:r>
+        <w:rPr>
+          <w:sz w:val="21"/>
+          <w:szCs w:val="21"/>
+        </w:rPr>
+        <w:t xml:space="preserve">개별 재료가 아니라 실제 한 끼에 가까운 조합(2~3가지 재료)으로 추천한다. 조합 풀은 영양소별 6개씩, 총 24개다(src/data/mealCombos.ts).</w:t>
+      </w:r>
+    </w:p>
+    <w:p>
+      <w:pPr>
+        <w:pStyle w:val="ListParagraph"/>
+        <w:numPr>
+          <w:ilvl w:val="0"/>
+          <w:numId w:val="2"/>
+        </w:numPr>
+        <w:spacing w:after="60"/>
+      </w:pPr>
+      <w:r>
+        <w:rPr>
+          <w:sz w:val="21"/>
+          <w:szCs w:val="21"/>
+        </w:rPr>
+        <w:t xml:space="preserve">단백질·탄수화물·지방·식이섬유의 달성률을 계산해, 100% 미달인 영양소를 달성률이 낮은 순으로 우선한다. 모두 충족됐다면 네 영양소 전체에서 추천한다.</w:t>
+      </w:r>
+    </w:p>
+    <w:p>
+      <w:pPr>
+        <w:pStyle w:val="ListParagraph"/>
+        <w:numPr>
+          <w:ilvl w:val="0"/>
+          <w:numId w:val="2"/>
+        </w:numPr>
+        <w:spacing w:after="60"/>
+      </w:pPr>
+      <w:r>
+        <w:rPr>
+          <w:sz w:val="21"/>
+          <w:szCs w:val="21"/>
+        </w:rPr>
+        <w:t xml:space="preserve">조합마다 "특히 더 어울리는 식단 목적"이 태그돼 있다. 같은 영양소를 채우는 조합이 여러 개면, 사용자의 현재 관리 목적(체지방감량/근육증가/체중유지/건강관리)과 맞는 조합을 먼저 보여준다.</w:t>
+      </w:r>
+    </w:p>
+    <w:p>
+      <w:pPr>
+        <w:pStyle w:val="ListParagraph"/>
+        <w:numPr>
+          <w:ilvl w:val="0"/>
+          <w:numId w:val="2"/>
+        </w:numPr>
+        <w:spacing w:after="60"/>
+      </w:pPr>
+      <w:r>
+        <w:rPr>
+          <w:sz w:val="21"/>
+          <w:szCs w:val="21"/>
+        </w:rPr>
+        <w:t xml:space="preserve">조합의 영양소 총량은 재료 id+중량으로 foodDatabase.ts를 참조해 계산한다(nutritionService.resolveMealCombo) — 숫자를 임의로 만들지 않는다.</w:t>
+      </w:r>
+    </w:p>
+    <w:p>
+      <w:pPr>
+        <w:pStyle w:val="Heading2"/>
+        <w:spacing w:after="100" w:before="240"/>
+      </w:pPr>
+      <w:r>
+        <w:rPr>
+          <w:b/>
+          <w:bCs/>
+          <w:sz w:val="24"/>
+          <w:szCs w:val="24"/>
+        </w:rPr>
+        <w:t xml:space="preserve">6.2 중복·다양성</w:t>
+      </w:r>
+    </w:p>
+    <w:p>
+      <w:pPr>
+        <w:pStyle w:val="ListParagraph"/>
+        <w:numPr>
+          <w:ilvl w:val="0"/>
+          <w:numId w:val="2"/>
+        </w:numPr>
+        <w:spacing w:after="60"/>
+      </w:pPr>
+      <w:r>
+        <w:rPr>
+          <w:sz w:val="21"/>
+          <w:szCs w:val="21"/>
+        </w:rPr>
+        <w:t xml:space="preserve">오늘 이미 먹은 모든 재료로만 구성된 조합은 추천에서 제외한다(재료 하나만 겹치는 건 제외하지 않는다 — 너무 많이 걸러지는 것을 방지).</w:t>
+      </w:r>
+    </w:p>
+    <w:p>
+      <w:pPr>
+        <w:pStyle w:val="ListParagraph"/>
+        <w:numPr>
+          <w:ilvl w:val="0"/>
+          <w:numId w:val="2"/>
+        </w:numPr>
+        <w:spacing w:after="60"/>
+      </w:pPr>
+      <w:r>
+        <w:rPr>
+          <w:sz w:val="21"/>
+          <w:szCs w:val="21"/>
+        </w:rPr>
+        <w:t xml:space="preserve">"오늘" 날짜를 시드로 추천 순서를 결정적으로 섞는다 — 같은 날엔 같은 추천이 유지되고, 날이 바뀌면 24개 풀에서 다른 조합이 나온다.</w:t>
+      </w:r>
+    </w:p>
+    <w:p>
+      <w:pPr>
+        <w:pStyle w:val="ListParagraph"/>
+        <w:numPr>
+          <w:ilvl w:val="0"/>
+          <w:numId w:val="2"/>
+        </w:numPr>
+        <w:spacing w:after="60"/>
+      </w:pPr>
+      <w:r>
+        <w:rPr>
+          <w:sz w:val="21"/>
+          <w:szCs w:val="21"/>
+        </w:rPr>
+        <w:t xml:space="preserve">최대 3개 조합까지 보여준다.</w:t>
+      </w:r>
+    </w:p>
+    <w:p>
+      <w:pPr>
+        <w:pStyle w:val="Heading2"/>
+        <w:spacing w:after="100" w:before="240"/>
+      </w:pPr>
+      <w:r>
+        <w:rPr>
+          <w:b/>
+          <w:bCs/>
+          <w:sz w:val="24"/>
+          <w:szCs w:val="24"/>
+        </w:rPr>
+        <w:t xml:space="preserve">6.3 AI 코칭 문구 — "결정은 규칙, 설명은 AI"</w:t>
+      </w:r>
+    </w:p>
+    <w:p>
+      <w:pPr>
+        <w:spacing w:after="120"/>
+      </w:pPr>
+      <w:r>
+        <w:rPr>
+          <w:i/>
+          <w:iCs/>
+          <w:color w:val="555555"/>
+          <w:sz w:val="19"/>
+          <w:szCs w:val="19"/>
+        </w:rPr>
+        <w:t xml:space="preserve">위치: server/coach.ts, POST /api/coach-meal</w:t>
+      </w:r>
+    </w:p>
+    <w:p>
+      <w:pPr>
+        <w:pStyle w:val="ListParagraph"/>
+        <w:numPr>
+          <w:ilvl w:val="0"/>
+          <w:numId w:val="2"/>
+        </w:numPr>
+        <w:spacing w:after="60"/>
+      </w:pPr>
+      <w:r>
+        <w:rPr>
+          <w:sz w:val="21"/>
+          <w:szCs w:val="21"/>
+        </w:rPr>
+        <w:t xml:space="preserve">무엇을 추천할지(음식·조합·수치)는 6.1~6.2의 규칙 기반 로직이 전부 결정한다. Claude는 그 결과를 한두 문장의 자연스러운 한국어로 설명하기만 하고, 음식이나 숫자를 새로 만들지 않는다.</w:t>
+      </w:r>
+    </w:p>
+    <w:p>
+      <w:pPr>
+        <w:pStyle w:val="ListParagraph"/>
+        <w:numPr>
+          <w:ilvl w:val="0"/>
+          <w:numId w:val="2"/>
+        </w:numPr>
+        <w:spacing w:after="60"/>
+      </w:pPr>
+      <w:r>
+        <w:rPr>
+          <w:sz w:val="21"/>
+          <w:szCs w:val="21"/>
+        </w:rPr>
+        <w:t xml:space="preserve">InBody·음식 사진 분석과 달리 이미지 없이 텍스트만 주고받는 요청이라 더 가볍고 빠르다.</w:t>
+      </w:r>
+    </w:p>
+    <w:p>
+      <w:pPr>
+        <w:pStyle w:val="ListParagraph"/>
+        <w:numPr>
+          <w:ilvl w:val="0"/>
+          <w:numId w:val="2"/>
+        </w:numPr>
+        <w:spacing w:after="60"/>
+      </w:pPr>
+      <w:r>
+        <w:rPr>
+          <w:sz w:val="21"/>
+          <w:szCs w:val="21"/>
+        </w:rPr>
+        <w:t xml:space="preserve">대시보드가 열릴 때 자동으로 호출하지 않는다 — 추천 카드의 "AI 코치 한마디 듣기" 버튼을 눌렀을 때만 호출해, 메인 화면 로딩 속도에 영향을 주지 않는다.</w:t>
       </w:r>
     </w:p>
     <w:p>
@@ -1086,7 +1282,7 @@
           <w:sz w:val="20"/>
           <w:szCs w:val="20"/>
         </w:rPr>
-        <w:t xml:space="preserve">※ 지금은 고정된 12개 음식 풀 + "오늘 섭취량"만 보는 규칙 기반 로직이다. 사용자의 식단 선호도나 알레르기, 반복 추천 방지 등은 아직 반영되지 않는다.</w:t>
+        <w:t xml:space="preserve">※ AI 호출이 실패해도(API Key 미설정, 레이트리밋 등) 추천 카드 자체는 항상 보이고, 미리 정해둔 기본 문구로 자연스럽게 대체된다. 식사 추천의 핵심 기능(무엇을 추천할지)은 AI 가용성과 무관하게 항상 동작한다.</w:t>
       </w:r>
     </w:p>
     <w:p>
@@ -1144,7 +1340,24 @@
           <w:sz w:val="21"/>
           <w:szCs w:val="21"/>
         </w:rPr>
-        <w:t xml:space="preserve">활동계수(1.4)와 추천 음식 풀(12개)은 현재 고정값이다.</w:t>
+        <w:t xml:space="preserve">활동계수(1.4)와 식사 조합 풀(24개)은 현재 고정값이다.</w:t>
+      </w:r>
+    </w:p>
+    <w:p>
+      <w:pPr>
+        <w:pStyle w:val="ListParagraph"/>
+        <w:numPr>
+          <w:ilvl w:val="0"/>
+          <w:numId w:val="2"/>
+        </w:numPr>
+        <w:spacing w:after="60"/>
+      </w:pPr>
+      <w:r>
+        <w:rPr>
+          <w:sz w:val="21"/>
+          <w:szCs w:val="21"/>
+        </w:rPr>
+        <w:t xml:space="preserve">사용자의 알레르기나 식재료 선호도(비건 등)는 아직 반영되지 않는다.</w:t>
       </w:r>
     </w:p>
     <w:p>

</xml_diff>